<commit_message>
Update AquiferOpenStudyNotesBookIntroSummaries for 2026-08-28
</commit_message>
<xml_diff>
--- a/arb/docx/46.content.docx
+++ b/arb/docx/46.content.docx
@@ -445,20 +445,14 @@
         </w:rPr>
         <w:t xml:space="preserve">كتبها بولس الرسول من أفسس أثناء رحلته التبشيرية الثالثة، ردًا على التقارير والأسئلة التي تلقاها من كنيسة كورنثوس (انظر </w:t>
       </w:r>
-      <w:hyperlink r:id="rId13">
-        <w:r>
-          <w:rPr>
-            <w:rtl/>
-            <w:cs/>
-            <w:lang w:val="ar_AE" w:bidi="ar_AE"/>
-          </w:rPr>
-          <w:rPr>
-            <w:color w:val="0000EE"/>
-            <w:u w:val="single"/>
-          </w:rPr>
-          <w:t>1 كورنثوس 1: 11</w:t>
-        </w:r>
-      </w:hyperlink>
+      <w:r>
+        <w:rPr>
+          <w:rtl/>
+          <w:cs/>
+          <w:lang w:val="ar_AE" w:bidi="ar_AE"/>
+        </w:rPr>
+        <w:t>1 كورنثوس 1: 11</w:t>
+      </w:r>
       <w:r>
         <w:rPr>
           <w:rtl/>
@@ -467,20 +461,14 @@
         </w:rPr>
         <w:t xml:space="preserve">؛ </w:t>
       </w:r>
-      <w:hyperlink r:id="rId14">
-        <w:r>
-          <w:rPr>
-            <w:rtl/>
-            <w:cs/>
-            <w:lang w:val="ar_AE" w:bidi="ar_AE"/>
-          </w:rPr>
-          <w:rPr>
-            <w:color w:val="0000EE"/>
-            <w:u w:val="single"/>
-          </w:rPr>
-          <w:t>5: 1</w:t>
-        </w:r>
-      </w:hyperlink>
+      <w:r>
+        <w:rPr>
+          <w:rtl/>
+          <w:cs/>
+          <w:lang w:val="ar_AE" w:bidi="ar_AE"/>
+        </w:rPr>
+        <w:t>5: 1</w:t>
+      </w:r>
       <w:r>
         <w:rPr>
           <w:rtl/>
@@ -489,20 +477,14 @@
         </w:rPr>
         <w:t xml:space="preserve">؛ </w:t>
       </w:r>
-      <w:hyperlink r:id="rId15">
-        <w:r>
-          <w:rPr>
-            <w:rtl/>
-            <w:cs/>
-            <w:lang w:val="ar_AE" w:bidi="ar_AE"/>
-          </w:rPr>
-          <w:rPr>
-            <w:color w:val="0000EE"/>
-            <w:u w:val="single"/>
-          </w:rPr>
-          <w:t>۷: ۱</w:t>
-        </w:r>
-      </w:hyperlink>
+      <w:r>
+        <w:rPr>
+          <w:rtl/>
+          <w:cs/>
+          <w:lang w:val="ar_AE" w:bidi="ar_AE"/>
+        </w:rPr>
+        <w:t>۷: ۱</w:t>
+      </w:r>
       <w:r>
         <w:rPr>
           <w:rtl/>
@@ -511,20 +493,14 @@
         </w:rPr>
         <w:t xml:space="preserve">؛ </w:t>
       </w:r>
-      <w:hyperlink r:id="rId16">
-        <w:r>
-          <w:rPr>
-            <w:rtl/>
-            <w:cs/>
-            <w:lang w:val="ar_AE" w:bidi="ar_AE"/>
-          </w:rPr>
-          <w:rPr>
-            <w:color w:val="0000EE"/>
-            <w:u w:val="single"/>
-          </w:rPr>
-          <w:t>8: 1</w:t>
-        </w:r>
-      </w:hyperlink>
+      <w:r>
+        <w:rPr>
+          <w:rtl/>
+          <w:cs/>
+          <w:lang w:val="ar_AE" w:bidi="ar_AE"/>
+        </w:rPr>
+        <w:t>8: 1</w:t>
+      </w:r>
       <w:r>
         <w:rPr>
           <w:rtl/>
@@ -533,20 +509,14 @@
         </w:rPr>
         <w:t xml:space="preserve">؛ </w:t>
       </w:r>
-      <w:hyperlink r:id="rId17">
-        <w:r>
-          <w:rPr>
-            <w:rtl/>
-            <w:cs/>
-            <w:lang w:val="ar_AE" w:bidi="ar_AE"/>
-          </w:rPr>
-          <w:rPr>
-            <w:color w:val="0000EE"/>
-            <w:u w:val="single"/>
-          </w:rPr>
-          <w:t>12: 1</w:t>
-        </w:r>
-      </w:hyperlink>
+      <w:r>
+        <w:rPr>
+          <w:rtl/>
+          <w:cs/>
+          <w:lang w:val="ar_AE" w:bidi="ar_AE"/>
+        </w:rPr>
+        <w:t>12: 1</w:t>
+      </w:r>
       <w:r>
         <w:rPr>
           <w:rtl/>
@@ -555,20 +525,14 @@
         </w:rPr>
         <w:t xml:space="preserve">؛ </w:t>
       </w:r>
-      <w:hyperlink r:id="rId18">
-        <w:r>
-          <w:rPr>
-            <w:rtl/>
-            <w:cs/>
-            <w:lang w:val="ar_AE" w:bidi="ar_AE"/>
-          </w:rPr>
-          <w:rPr>
-            <w:color w:val="0000EE"/>
-            <w:u w:val="single"/>
-          </w:rPr>
-          <w:t>16: 1</w:t>
-        </w:r>
-      </w:hyperlink>
+      <w:r>
+        <w:rPr>
+          <w:rtl/>
+          <w:cs/>
+          <w:lang w:val="ar_AE" w:bidi="ar_AE"/>
+        </w:rPr>
+        <w:t>16: 1</w:t>
+      </w:r>
       <w:r>
         <w:rPr>
           <w:rtl/>

</xml_diff>